<commit_message>
docs: document discovery, monitoring, preview, and reliability work
PROGRESS.md: phases 6-9 with per-file change tables and verification notes.
Super_Scraper_Project_Guide.docx: new Section 17 covering the implemented
discovery, monitoring, output-preview, and engine-reliability features.
</commit_message>
<xml_diff>
--- a/docs/Super_Scraper_Project_Guide.docx
+++ b/docs/Super_Scraper_Project_Guide.docx
@@ -12135,6 +12135,942 @@
       </w:pPr>
       <w:r>
         <w:t xml:space="preserve">Surface LangSmith traces for agent observability (already supported via env).</w:t>
+      </w:r>
+    </w:p>
+    <w:p>
+      <w:pPr>
+        <w:pStyle w:val="Heading1"/>
+      </w:pPr>
+      <w:r>
+        <w:t xml:space="preserve">16. Future Scope: Discovery &amp; Retention Roadmap</w:t>
+      </w:r>
+    </w:p>
+    <w:p>
+      <w:pPr>
+        <w:spacing w:after="120"/>
+      </w:pPr>
+      <w:r>
+        <w:t xml:space="preserve">This section captures features discussed for the product but deliberately deferred, together with the order we plan to build them. It complements Section 15 (Roadmap), which lists near-term hardening tasks. Items are grouped as committed, next milestone, and future scope.</w:t>
+      </w:r>
+    </w:p>
+    <w:p>
+      <w:pPr>
+        <w:pStyle w:val="Heading2"/>
+      </w:pPr>
+      <w:r>
+        <w:t xml:space="preserve">16.1 Roadmap at a glance</w:t>
+      </w:r>
+    </w:p>
+    <w:p>
+      <w:pPr>
+        <w:pStyle w:val="ListParagraph"/>
+        <w:numPr>
+          <w:ilvl w:val="0"/>
+          <w:numId w:val="1"/>
+        </w:numPr>
+      </w:pPr>
+      <w:r>
+        <w:rPr>
+          <w:b/>
+        </w:rPr>
+        <w:t xml:space="preserve">Committed (Phase 1–2): </w:t>
+      </w:r>
+      <w:r>
+        <w:t xml:space="preserve">On-site discovery – for a user-supplied URL, map the site’s sections (Reports, Blogs, Products, etc.), then enumerate the entries within a chosen section so the user can pick one or many to scrape. Two retention quick wins fold in here: saving a selection as a reusable recipe, and a live preview of the first few rows during selection.</w:t>
+      </w:r>
+    </w:p>
+    <w:p>
+      <w:pPr>
+        <w:pStyle w:val="ListParagraph"/>
+        <w:numPr>
+          <w:ilvl w:val="0"/>
+          <w:numId w:val="1"/>
+        </w:numPr>
+      </w:pPr>
+      <w:r>
+        <w:rPr>
+          <w:b/>
+        </w:rPr>
+        <w:t xml:space="preserve">Next milestone: </w:t>
+      </w:r>
+      <w:r>
+        <w:t xml:space="preserve">Monitoring bundle – change detection, alerts/notifications, and a run history with a diff view. This is the strongest retention lever and reuses the existing scheduling and destinations plumbing.</w:t>
+      </w:r>
+    </w:p>
+    <w:p>
+      <w:pPr>
+        <w:pStyle w:val="ListParagraph"/>
+        <w:numPr>
+          <w:ilvl w:val="0"/>
+          <w:numId w:val="1"/>
+        </w:numPr>
+      </w:pPr>
+      <w:r>
+        <w:rPr>
+          <w:b/>
+        </w:rPr>
+        <w:t xml:space="preserve">Future scope (this section): </w:t>
+      </w:r>
+      <w:r>
+        <w:t xml:space="preserve">conversational refinement (multi-turn chat) and a web-search “universal” scraper that finds sources when the user has no URL.</w:t>
+      </w:r>
+    </w:p>
+    <w:p>
+      <w:pPr>
+        <w:pStyle w:val="Heading2"/>
+      </w:pPr>
+      <w:r>
+        <w:t xml:space="preserve">16.2 Committed – Phase 1 &amp; 2: On-site discovery</w:t>
+      </w:r>
+    </w:p>
+    <w:p>
+      <w:pPr>
+        <w:spacing w:after="120"/>
+      </w:pPr>
+      <w:r>
+        <w:t xml:space="preserve">Adds two steps in front of the existing plan–harvest–extract flow.</w:t>
+      </w:r>
+    </w:p>
+    <w:p>
+      <w:pPr>
+        <w:pStyle w:val="ListParagraph"/>
+        <w:numPr>
+          <w:ilvl w:val="0"/>
+          <w:numId w:val="1"/>
+        </w:numPr>
+      </w:pPr>
+      <w:r>
+        <w:rPr>
+          <w:b/>
+        </w:rPr>
+        <w:t xml:space="preserve">map_site: </w:t>
+      </w:r>
+      <w:r>
+        <w:t xml:space="preserve">fetch the target URL, read its header/navigation, and classify links into named sections. Mostly DOM parsing plus one small Gemini classification call.</w:t>
+      </w:r>
+    </w:p>
+    <w:p>
+      <w:pPr>
+        <w:pStyle w:val="ListParagraph"/>
+        <w:numPr>
+          <w:ilvl w:val="0"/>
+          <w:numId w:val="1"/>
+        </w:numPr>
+      </w:pPr>
+      <w:r>
+        <w:rPr>
+          <w:b/>
+        </w:rPr>
+        <w:t xml:space="preserve">list_items: </w:t>
+      </w:r>
+      <w:r>
+        <w:t xml:space="preserve">for the chosen section, enumerate the entries (e.g., the list of reports) and return them as a multi-select pick-list.</w:t>
+      </w:r>
+    </w:p>
+    <w:p>
+      <w:pPr>
+        <w:pStyle w:val="ListParagraph"/>
+        <w:numPr>
+          <w:ilvl w:val="0"/>
+          <w:numId w:val="1"/>
+        </w:numPr>
+      </w:pPr>
+      <w:r>
+        <w:rPr>
+          <w:b/>
+        </w:rPr>
+        <w:t xml:space="preserve">Multi-select to scrape: </w:t>
+      </w:r>
+      <w:r>
+        <w:t xml:space="preserve">the existing extract pipeline runs over the chosen entries.</w:t>
+      </w:r>
+    </w:p>
+    <w:p>
+      <w:pPr>
+        <w:pStyle w:val="ListParagraph"/>
+        <w:numPr>
+          <w:ilvl w:val="0"/>
+          <w:numId w:val="1"/>
+        </w:numPr>
+      </w:pPr>
+      <w:r>
+        <w:rPr>
+          <w:b/>
+        </w:rPr>
+        <w:t xml:space="preserve">Save as recipe: </w:t>
+      </w:r>
+      <w:r>
+        <w:t xml:space="preserve">promote the already-cached CSS schema into a named, re-runnable object so a selection can be reused on similar URLs and shared.</w:t>
+      </w:r>
+    </w:p>
+    <w:p>
+      <w:pPr>
+        <w:pStyle w:val="ListParagraph"/>
+        <w:numPr>
+          <w:ilvl w:val="0"/>
+          <w:numId w:val="1"/>
+        </w:numPr>
+      </w:pPr>
+      <w:r>
+        <w:rPr>
+          <w:b/>
+        </w:rPr>
+        <w:t xml:space="preserve">Live preview: </w:t>
+      </w:r>
+      <w:r>
+        <w:t xml:space="preserve">show the first 3–5 extracted rows in the pick-list before committing the full run, to build trust and cut abandonment.</w:t>
+      </w:r>
+    </w:p>
+    <w:p>
+      <w:pPr>
+        <w:pStyle w:val="ListParagraph"/>
+        <w:numPr>
+          <w:ilvl w:val="0"/>
+          <w:numId w:val="1"/>
+        </w:numPr>
+      </w:pPr>
+      <w:r>
+        <w:rPr>
+          <w:b/>
+        </w:rPr>
+        <w:t xml:space="preserve">Architecture note: </w:t>
+      </w:r>
+      <w:r>
+        <w:t xml:space="preserve">once selection spans multiple turns, a run can no longer be one fire-and-forget Celery task. It needs human-in-the-loop, persisted graph state – a LangGraph checkpointer with interrupt/resume, with state stored in Postgres or Redis keyed to the conversation.</w:t>
+      </w:r>
+    </w:p>
+    <w:p>
+      <w:pPr>
+        <w:pStyle w:val="Heading2"/>
+      </w:pPr>
+      <w:r>
+        <w:t xml:space="preserve">16.3 Next milestone – Monitoring &amp; retention bundle</w:t>
+      </w:r>
+    </w:p>
+    <w:p>
+      <w:pPr>
+        <w:pStyle w:val="ListParagraph"/>
+        <w:numPr>
+          <w:ilvl w:val="0"/>
+          <w:numId w:val="1"/>
+        </w:numPr>
+      </w:pPr>
+      <w:r>
+        <w:rPr>
+          <w:b/>
+        </w:rPr>
+        <w:t xml:space="preserve">Change detection: </w:t>
+      </w:r>
+      <w:r>
+        <w:t xml:space="preserve">snapshot each run’s output and diff it against the previous run.</w:t>
+      </w:r>
+    </w:p>
+    <w:p>
+      <w:pPr>
+        <w:pStyle w:val="ListParagraph"/>
+        <w:numPr>
+          <w:ilvl w:val="0"/>
+          <w:numId w:val="1"/>
+        </w:numPr>
+      </w:pPr>
+      <w:r>
+        <w:rPr>
+          <w:b/>
+        </w:rPr>
+        <w:t xml:space="preserve">Alerts &amp; notifications: </w:t>
+      </w:r>
+      <w:r>
+        <w:t xml:space="preserve">notify on change via email, Slack, or Discord by generalizing the existing webhook destination.</w:t>
+      </w:r>
+    </w:p>
+    <w:p>
+      <w:pPr>
+        <w:pStyle w:val="ListParagraph"/>
+        <w:numPr>
+          <w:ilvl w:val="0"/>
+          <w:numId w:val="1"/>
+        </w:numPr>
+      </w:pPr>
+      <w:r>
+        <w:rPr>
+          <w:b/>
+        </w:rPr>
+        <w:t xml:space="preserve">Run history &amp; diff view: </w:t>
+      </w:r>
+      <w:r>
+        <w:t xml:space="preserve">browse the timeline of runs and see exactly what changed since last time.</w:t>
+      </w:r>
+    </w:p>
+    <w:p>
+      <w:pPr>
+        <w:pStyle w:val="ListParagraph"/>
+        <w:numPr>
+          <w:ilvl w:val="0"/>
+          <w:numId w:val="1"/>
+        </w:numPr>
+      </w:pPr>
+      <w:r>
+        <w:rPr>
+          <w:b/>
+        </w:rPr>
+        <w:t xml:space="preserve">Why it matters: </w:t>
+      </w:r>
+      <w:r>
+        <w:t xml:space="preserve">this converts the product from on-demand (“use it when I need data”) to always-on (“it works for me 24/7”), which is the biggest retention driver. The scheduling beat loop and destinations already cover most of the plumbing.</w:t>
+      </w:r>
+    </w:p>
+    <w:p>
+      <w:pPr>
+        <w:pStyle w:val="Heading2"/>
+      </w:pPr>
+      <w:r>
+        <w:t xml:space="preserve">16.4 Future scope – Phase 3: Conversational refinement</w:t>
+      </w:r>
+    </w:p>
+    <w:p>
+      <w:pPr>
+        <w:pStyle w:val="ListParagraph"/>
+        <w:numPr>
+          <w:ilvl w:val="0"/>
+          <w:numId w:val="1"/>
+        </w:numPr>
+      </w:pPr>
+      <w:r>
+        <w:t xml:space="preserve">Multi-turn chat that lets the user narrow intent, sections, and items across several turns rather than in one shot.</w:t>
+      </w:r>
+    </w:p>
+    <w:p>
+      <w:pPr>
+        <w:pStyle w:val="ListParagraph"/>
+        <w:numPr>
+          <w:ilvl w:val="0"/>
+          <w:numId w:val="1"/>
+        </w:numPr>
+      </w:pPr>
+      <w:r>
+        <w:t xml:space="preserve">Depends on the human-in-the-loop graph state from Phase 1–2 (LangGraph checkpointer plus interrupt/resume); graph state is persisted and keyed to a conversation.</w:t>
+      </w:r>
+    </w:p>
+    <w:p>
+      <w:pPr>
+        <w:pStyle w:val="Heading2"/>
+      </w:pPr>
+      <w:r>
+        <w:t xml:space="preserve">16.5 Future scope – Phase 4: Web-search universal scraper</w:t>
+      </w:r>
+    </w:p>
+    <w:p>
+      <w:pPr>
+        <w:spacing w:after="120"/>
+      </w:pPr>
+      <w:r>
+        <w:t xml:space="preserve">The user states a need without giving a URL; the system uses web search (Gemini grounding or a search API) to find candidate sources, presents them, lets the user pick, and then runs the existing extract pipeline. Risks to design around:</w:t>
+      </w:r>
+    </w:p>
+    <w:p>
+      <w:pPr>
+        <w:pStyle w:val="ListParagraph"/>
+        <w:numPr>
+          <w:ilvl w:val="0"/>
+          <w:numId w:val="1"/>
+        </w:numPr>
+      </w:pPr>
+      <w:r>
+        <w:rPr>
+          <w:b/>
+        </w:rPr>
+        <w:t xml:space="preserve">Cost: </w:t>
+      </w:r>
+      <w:r>
+        <w:t xml:space="preserve">search plus multi-site crawl and extract is unbounded and conflicts with the project’s cost-minimization rule (see Section 13). Requires a hard per-conversation budget cap.</w:t>
+      </w:r>
+    </w:p>
+    <w:p>
+      <w:pPr>
+        <w:pStyle w:val="ListParagraph"/>
+        <w:numPr>
+          <w:ilvl w:val="0"/>
+          <w:numId w:val="1"/>
+        </w:numPr>
+      </w:pPr>
+      <w:r>
+        <w:rPr>
+          <w:b/>
+        </w:rPr>
+        <w:t xml:space="preserve">Source responsibility: </w:t>
+      </w:r>
+      <w:r>
+        <w:t xml:space="preserve">once the system chooses the sites, relevance, trust, and legal exposure shift to us. Always show the chosen sources and get explicit user consent before scraping.</w:t>
+      </w:r>
+    </w:p>
+    <w:p>
+      <w:pPr>
+        <w:pStyle w:val="ListParagraph"/>
+        <w:numPr>
+          <w:ilvl w:val="0"/>
+          <w:numId w:val="1"/>
+        </w:numPr>
+      </w:pPr>
+      <w:r>
+        <w:rPr>
+          <w:b/>
+        </w:rPr>
+        <w:t xml:space="preserve">Overpromising: </w:t>
+      </w:r>
+      <w:r>
+        <w:t xml:space="preserve">a confident chat UI can mask the share of sites that do not extract cleanly. Set expectations and surface failures rather than hiding them.</w:t>
+      </w:r>
+    </w:p>
+    <w:p>
+      <w:pPr>
+        <w:pStyle w:val="ListParagraph"/>
+        <w:numPr>
+          <w:ilvl w:val="0"/>
+          <w:numId w:val="1"/>
+        </w:numPr>
+      </w:pPr>
+      <w:r>
+        <w:rPr>
+          <w:b/>
+        </w:rPr>
+        <w:t xml:space="preserve">Prerequisite: </w:t>
+      </w:r>
+      <w:r>
+        <w:t xml:space="preserve">Phase 3 (conversational state) should land first.</w:t>
+      </w:r>
+    </w:p>
+    <w:p>
+      <w:pPr>
+        <w:pStyle w:val="Heading1"/>
+      </w:pPr>
+      <w:r>
+        <w:t xml:space="preserve">17. Implemented Features: Discovery, Monitoring &amp; Reliability</w:t>
+      </w:r>
+    </w:p>
+    <w:p>
+      <w:pPr>
+        <w:spacing w:after="120"/>
+      </w:pPr>
+      <w:r>
+        <w:t xml:space="preserve">This section documents the features built in the second implementation sprint (Phases 6–9). All changes are in the working tree on branch initial-run-testing, not yet committed.</w:t>
+      </w:r>
+    </w:p>
+    <w:p>
+      <w:pPr>
+        <w:pStyle w:val="Heading2"/>
+      </w:pPr>
+      <w:r>
+        <w:t xml:space="preserve">17.1 Phase 6 – On-site Discovery (map_site + list_items)</w:t>
+      </w:r>
+    </w:p>
+    <w:p>
+      <w:pPr>
+        <w:spacing w:after="120"/>
+      </w:pPr>
+      <w:r>
+        <w:t xml:space="preserve">A new user flow: paste a URL → see what sections the site offers → pick a section → multi-select individual entries → describe what to extract → Create job or Save as recipe. No LLM or cost involved in discovery — pure BeautifulSoup heuristics.</w:t>
+      </w:r>
+    </w:p>
+    <w:p>
+      <w:pPr>
+        <w:pStyle w:val="Heading2"/>
+      </w:pPr>
+      <w:r>
+        <w:t xml:space="preserve">17.1.1 New backend files</w:t>
+      </w:r>
+    </w:p>
+    <w:p>
+      <w:pPr>
+        <w:pStyle w:val="ListParagraph"/>
+        <w:numPr>
+          <w:ilvl w:val="0"/>
+          <w:numId w:val="1"/>
+        </w:numPr>
+      </w:pPr>
+      <w:r>
+        <w:rPr>
+          <w:b/>
+        </w:rPr>
+        <w:t xml:space="preserve">backend/apps/scraper/discovery.py: </w:t>
+      </w:r>
+      <w:r>
+        <w:t xml:space="preserve">discover_sections (nav → section list) and discover_items (repeating-link pick-list). Scopes to the page’s main content landmark (&lt;main&gt;/article/#content) so header/nav/footer chrome is excluded without brittle class filtering. _best_label recovers proper titles from generic “View”/“Download” anchors by reading the row heading or surrounding row text.</w:t>
+      </w:r>
+    </w:p>
+    <w:p>
+      <w:pPr>
+        <w:pStyle w:val="ListParagraph"/>
+        <w:numPr>
+          <w:ilvl w:val="0"/>
+          <w:numId w:val="1"/>
+        </w:numPr>
+      </w:pPr>
+      <w:r>
+        <w:rPr>
+          <w:b/>
+        </w:rPr>
+        <w:t xml:space="preserve">backend/apps/scraper/models.py – ScrapeRecipe: </w:t>
+      </w:r>
+      <w:r>
+        <w:t xml:space="preserve">fields name, source_url, section_label, prompt, items (JSON list of {title, url}), selectors, use_js_rendering, respect_robots_txt. item_urls property returns selected entry URLs. Migration 0004_scraperecipe.py.</w:t>
+      </w:r>
+    </w:p>
+    <w:p>
+      <w:pPr>
+        <w:pStyle w:val="ListParagraph"/>
+        <w:numPr>
+          <w:ilvl w:val="0"/>
+          <w:numId w:val="1"/>
+        </w:numPr>
+      </w:pPr>
+      <w:r>
+        <w:rPr>
+          <w:b/>
+        </w:rPr>
+        <w:t xml:space="preserve">serializers.py: </w:t>
+      </w:r>
+      <w:r>
+        <w:t xml:space="preserve">DiscoverRequestSerializer, ScrapeRecipeSerializer (with item_urls read-only).</w:t>
+      </w:r>
+    </w:p>
+    <w:p>
+      <w:pPr>
+        <w:pStyle w:val="ListParagraph"/>
+        <w:numPr>
+          <w:ilvl w:val="0"/>
+          <w:numId w:val="1"/>
+        </w:numPr>
+      </w:pPr>
+      <w:r>
+        <w:rPr>
+          <w:b/>
+        </w:rPr>
+        <w:t xml:space="preserve">views.py + urls.py: </w:t>
+      </w:r>
+      <w:r>
+        <w:t xml:space="preserve">DiscoverSectionsView (POST /discover-sections/), DiscoverItemsView (POST /discover-items/), ScrapeRecipeViewSet with create_job action.</w:t>
+      </w:r>
+    </w:p>
+    <w:p>
+      <w:pPr>
+        <w:pStyle w:val="Heading2"/>
+      </w:pPr>
+      <w:r>
+        <w:t xml:space="preserve">17.1.2 New frontend files</w:t>
+      </w:r>
+    </w:p>
+    <w:p>
+      <w:pPr>
+        <w:pStyle w:val="ListParagraph"/>
+        <w:numPr>
+          <w:ilvl w:val="0"/>
+          <w:numId w:val="1"/>
+        </w:numPr>
+      </w:pPr>
+      <w:r>
+        <w:rPr>
+          <w:b/>
+        </w:rPr>
+        <w:t xml:space="preserve">frontend/app/discover/page.tsx: </w:t>
+      </w:r>
+      <w:r>
+        <w:t xml:space="preserve">Discovery wizard. URL → section buttons → scrollable multi-select (nothing pre-checked; user opts in). Each entry has a 👁 Preview button that renders a live screenshot via the existing /snapshot/ endpoint and displays it inline. Create job or Save as recipe actions at the bottom.</w:t>
+      </w:r>
+    </w:p>
+    <w:p>
+      <w:pPr>
+        <w:pStyle w:val="ListParagraph"/>
+        <w:numPr>
+          <w:ilvl w:val="0"/>
+          <w:numId w:val="1"/>
+        </w:numPr>
+      </w:pPr>
+      <w:r>
+        <w:rPr>
+          <w:b/>
+        </w:rPr>
+        <w:t xml:space="preserve">frontend/lib/api.ts additions: </w:t>
+      </w:r>
+      <w:r>
+        <w:t xml:space="preserve">discoverSections, discoverItems, listRecipes, createRecipe, deleteRecipe, createJobFromRecipe + Section, DiscoverItem, Recipe types.</w:t>
+      </w:r>
+    </w:p>
+    <w:p>
+      <w:pPr>
+        <w:pStyle w:val="ListParagraph"/>
+        <w:numPr>
+          <w:ilvl w:val="0"/>
+          <w:numId w:val="1"/>
+        </w:numPr>
+      </w:pPr>
+      <w:r>
+        <w:rPr>
+          <w:b/>
+        </w:rPr>
+        <w:t xml:space="preserve">Dashboard (app/page.tsx): </w:t>
+      </w:r>
+      <w:r>
+        <w:t xml:space="preserve">🧭 Discover button added next to Visual Selector.</w:t>
+      </w:r>
+    </w:p>
+    <w:p>
+      <w:pPr>
+        <w:pStyle w:val="Heading2"/>
+      </w:pPr>
+      <w:r>
+        <w:t xml:space="preserve">17.2 Phase 7 – Monitoring: Change Detection, Alerts, Run History Diff</w:t>
+      </w:r>
+    </w:p>
+    <w:p>
+      <w:pPr>
+        <w:spacing w:after="120"/>
+      </w:pPr>
+      <w:r>
+        <w:t xml:space="preserve">Every successful run’s content is fingerprinted and diffed against the previous run. When content changes and the job opts in, a change alert fires to Slack, Discord, a webhook, or email. The job detail page shows a Changes column in the Runs table with an expandable diff.</w:t>
+      </w:r>
+    </w:p>
+    <w:p>
+      <w:pPr>
+        <w:pStyle w:val="Heading2"/>
+      </w:pPr>
+      <w:r>
+        <w:t xml:space="preserve">17.2.1 New backend files</w:t>
+      </w:r>
+    </w:p>
+    <w:p>
+      <w:pPr>
+        <w:pStyle w:val="ListParagraph"/>
+        <w:numPr>
+          <w:ilvl w:val="0"/>
+          <w:numId w:val="1"/>
+        </w:numPr>
+      </w:pPr>
+      <w:r>
+        <w:rPr>
+          <w:b/>
+        </w:rPr>
+        <w:t xml:space="preserve">backend/apps/scraper/monitoring.py: </w:t>
+      </w:r>
+      <w:r>
+        <w:t xml:space="preserve">build_content_index hashes each non-empty row (up to 5 000; previews for 500). diff_indexes computes added/removed/unchanged counts and 25-row text samples. previous_indexed_run walks back up to 25 runs for the last successful baseline. Only successful runs are indexed so a transient empty run never becomes a false baseline.</w:t>
+      </w:r>
+    </w:p>
+    <w:p>
+      <w:pPr>
+        <w:pStyle w:val="ListParagraph"/>
+        <w:numPr>
+          <w:ilvl w:val="0"/>
+          <w:numId w:val="1"/>
+        </w:numPr>
+      </w:pPr>
+      <w:r>
+        <w:rPr>
+          <w:b/>
+        </w:rPr>
+        <w:t xml:space="preserve">backend/apps/scraper/notifications.py: </w:t>
+      </w:r>
+      <w:r>
+        <w:t xml:space="preserve">send_change_alert delivers to each configured channel. Slack/Discord: HTTP POST {“text”/“content”: “…”}. Webhook: structured JSON {event, job, run_id, change, message}. Email: Django mail backend. Per-channel failures recorded and returned, never fatal.</w:t>
+      </w:r>
+    </w:p>
+    <w:p>
+      <w:pPr>
+        <w:pStyle w:val="ListParagraph"/>
+        <w:numPr>
+          <w:ilvl w:val="0"/>
+          <w:numId w:val="1"/>
+        </w:numPr>
+      </w:pPr>
+      <w:r>
+        <w:rPr>
+          <w:b/>
+        </w:rPr>
+        <w:t xml:space="preserve">Migration 0005_change_detection_and_alerts.py: </w:t>
+      </w:r>
+      <w:r>
+        <w:t xml:space="preserve">adds JobRun.content_index (JSONField, server-side only, not serialized), ScrapeJob.notify_on_change (BooleanField), ScrapeJob.notify_config (JSONField with channels array).</w:t>
+      </w:r>
+    </w:p>
+    <w:p>
+      <w:pPr>
+        <w:pStyle w:val="Heading2"/>
+      </w:pPr>
+      <w:r>
+        <w:t xml:space="preserve">17.2.2 Changed backend files</w:t>
+      </w:r>
+    </w:p>
+    <w:p>
+      <w:pPr>
+        <w:pStyle w:val="ListParagraph"/>
+        <w:numPr>
+          <w:ilvl w:val="0"/>
+          <w:numId w:val="1"/>
+        </w:numPr>
+      </w:pPr>
+      <w:r>
+        <w:rPr>
+          <w:b/>
+        </w:rPr>
+        <w:t xml:space="preserve">tasks.py: </w:t>
+      </w:r>
+      <w:r>
+        <w:t xml:space="preserve">after finalization calls monitoring.build_content_index + diff_indexes, stores result in stats[‘change’]. If notify_on_change and change.changed, calls send_change_alert. Diffing is wrapped in try/except so it never fails a run.</w:t>
+      </w:r>
+    </w:p>
+    <w:p>
+      <w:pPr>
+        <w:pStyle w:val="ListParagraph"/>
+        <w:numPr>
+          <w:ilvl w:val="0"/>
+          <w:numId w:val="1"/>
+        </w:numPr>
+      </w:pPr>
+      <w:r>
+        <w:rPr>
+          <w:b/>
+        </w:rPr>
+        <w:t xml:space="preserve">serializers.py: </w:t>
+      </w:r>
+      <w:r>
+        <w:t xml:space="preserve">change_summary added to JobRunSerializer + JobRunListSerializer. notify_on_change and notify_config exposed on ScrapeJobSerializer + CreateScrapeJobSerializer.</w:t>
+      </w:r>
+    </w:p>
+    <w:p>
+      <w:pPr>
+        <w:pStyle w:val="ListParagraph"/>
+        <w:numPr>
+          <w:ilvl w:val="0"/>
+          <w:numId w:val="1"/>
+        </w:numPr>
+      </w:pPr>
+      <w:r>
+        <w:rPr>
+          <w:b/>
+        </w:rPr>
+        <w:t xml:space="preserve">views.py: </w:t>
+      </w:r>
+      <w:r>
+        <w:t xml:space="preserve">test_alert action on ScrapeJobViewSet sends a sample payload to all configured channels; returns 200 on success, 400 if no channels configured.</w:t>
+      </w:r>
+    </w:p>
+    <w:p>
+      <w:pPr>
+        <w:pStyle w:val="Heading2"/>
+      </w:pPr>
+      <w:r>
+        <w:t xml:space="preserve">17.2.3 New frontend files</w:t>
+      </w:r>
+    </w:p>
+    <w:p>
+      <w:pPr>
+        <w:pStyle w:val="ListParagraph"/>
+        <w:numPr>
+          <w:ilvl w:val="0"/>
+          <w:numId w:val="1"/>
+        </w:numPr>
+      </w:pPr>
+      <w:r>
+        <w:rPr>
+          <w:b/>
+        </w:rPr>
+        <w:t xml:space="preserve">frontend/components/Alerts.tsx: </w:t>
+      </w:r>
+      <w:r>
+        <w:t xml:space="preserve">Alert configuration panel on the job detail page. Toggle notify_on_change, add/remove channels (type dropdown + target input), Save button (PATCH job), Send test button (POST /test_alert/). Mirrors the Destinations panel design.</w:t>
+      </w:r>
+    </w:p>
+    <w:p>
+      <w:pPr>
+        <w:pStyle w:val="ListParagraph"/>
+        <w:numPr>
+          <w:ilvl w:val="0"/>
+          <w:numId w:val="1"/>
+        </w:numPr>
+      </w:pPr>
+      <w:r>
+        <w:rPr>
+          <w:b/>
+        </w:rPr>
+        <w:t xml:space="preserve">app/jobs/[id]/page.tsx changes: </w:t>
+      </w:r>
+      <w:r>
+        <w:t xml:space="preserve">Changes column in Runs table shows +added −removed as a clickable button; expands to ChangeDetail showing per-row text samples. Alerts panel added below Schedule + Destinations.</w:t>
+      </w:r>
+    </w:p>
+    <w:p>
+      <w:pPr>
+        <w:pStyle w:val="Heading2"/>
+      </w:pPr>
+      <w:r>
+        <w:t xml:space="preserve">17.3 Phase 8 – Output Preview (dry run before full run)</w:t>
+      </w:r>
+    </w:p>
+    <w:p>
+      <w:pPr>
+        <w:spacing w:after="120"/>
+      </w:pPr>
+      <w:r>
+        <w:t xml:space="preserve">A “🔎 Preview output” button on the dashboard create form and every job detail page dispatches a bounded Celery task that fetches and LLM-extracts up to 8 rows from the first page — without persisting anything. The user sees sample columns and values before committing to a full run. Preview state is saved to localStorage so it survives navigation, and polling resumes if the user navigates away while the task is in flight.</w:t>
+      </w:r>
+    </w:p>
+    <w:p>
+      <w:pPr>
+        <w:pStyle w:val="ListParagraph"/>
+        <w:numPr>
+          <w:ilvl w:val="0"/>
+          <w:numId w:val="1"/>
+        </w:numPr>
+      </w:pPr>
+      <w:r>
+        <w:rPr>
+          <w:b/>
+        </w:rPr>
+        <w:t xml:space="preserve">backend/apps/scraper/tasks.py – _preview_extract + preview_scrape_task: </w:t>
+      </w:r>
+      <w:r>
+        <w:t xml:space="preserve">_preview_extract does one fetch (scan_full_page=False for speed) + plan + extract, returns rows and error. preview_scrape_task dispatches CSS test or _preview_extract based on whether selectors exist; returns {success, url, columns, rows, count, error}.</w:t>
+      </w:r>
+    </w:p>
+    <w:p>
+      <w:pPr>
+        <w:pStyle w:val="ListParagraph"/>
+        <w:numPr>
+          <w:ilvl w:val="0"/>
+          <w:numId w:val="1"/>
+        </w:numPr>
+      </w:pPr>
+      <w:r>
+        <w:rPr>
+          <w:b/>
+        </w:rPr>
+        <w:t xml:space="preserve">backend/apps/scraper/views.py – PreviewScrapeView: </w:t>
+      </w:r>
+      <w:r>
+        <w:t xml:space="preserve">POST /api/scraper/preview/ validates URL(s), dispatches preview_scrape_task, returns {task_id} as 202. Client polls /task-status/{id}/ until ready.</w:t>
+      </w:r>
+    </w:p>
+    <w:p>
+      <w:pPr>
+        <w:pStyle w:val="ListParagraph"/>
+        <w:numPr>
+          <w:ilvl w:val="0"/>
+          <w:numId w:val="1"/>
+        </w:numPr>
+      </w:pPr>
+      <w:r>
+        <w:rPr>
+          <w:b/>
+        </w:rPr>
+        <w:t xml:space="preserve">frontend/components/PreviewOutput.tsx: </w:t>
+      </w:r>
+      <w:r>
+        <w:t xml:space="preserve">Persists to localStorage under ss_preview_{storageKey}. On mount: restores a finished result, or resumes polling a still-running task by its saved task_id. Clear button drops stored state. storageKey is “dashboard” for the create form and “job-{id}” for a job detail page.</w:t>
+      </w:r>
+    </w:p>
+    <w:p>
+      <w:pPr>
+        <w:pStyle w:val="Heading2"/>
+      </w:pPr>
+      <w:r>
+        <w:t xml:space="preserve">17.4 Phase 9 – Engine Reliability Fixes</w:t>
+      </w:r>
+    </w:p>
+    <w:p>
+      <w:pPr>
+        <w:spacing w:after="120"/>
+      </w:pPr>
+      <w:r>
+        <w:t xml:space="preserve">All five fixes are generic (not site-specific) and improve reliability across the full scraping pipeline.</w:t>
+      </w:r>
+    </w:p>
+    <w:p>
+      <w:pPr>
+        <w:pStyle w:val="ListParagraph"/>
+        <w:numPr>
+          <w:ilvl w:val="0"/>
+          <w:numId w:val="1"/>
+        </w:numPr>
+      </w:pPr>
+      <w:r>
+        <w:rPr>
+          <w:b/>
+        </w:rPr>
+        <w:t xml:space="preserve">Fetch timeout raised to 90s: </w:t>
+      </w:r>
+      <w:r>
+        <w:t xml:space="preserve">backend/.env SCRAPER_TIMEOUT=30 → 90; settings.py default 30 → 60. Root cause: headless browser page.goto() threw after 30s on slow server-rendered pages (e.g. large PHP tables) — engine returned “fetch failed” — agent got zero content — 0 rows, misleadingly marked success. 90s gives slow servers headroom; fast sites are unaffected.</w:t>
+      </w:r>
+    </w:p>
+    <w:p>
+      <w:pPr>
+        <w:pStyle w:val="ListParagraph"/>
+        <w:numPr>
+          <w:ilvl w:val="0"/>
+          <w:numId w:val="1"/>
+        </w:numPr>
+      </w:pPr>
+      <w:r>
+        <w:rPr>
+          <w:b/>
+        </w:rPr>
+        <w:t xml:space="preserve">scan_full_page — on by default, off for preview: </w:t>
+      </w:r>
+      <w:r>
+        <w:t xml:space="preserve">Real runs keep scan_full_page=True so infinite-scroll and lazy-loaded content loads automatically. The preview task passes scan_full_page=False for speed (it only samples page one). The flag is threaded through BaseEngine.fetch(), Crawl4AIEngine._run_config(), and fetch_with_fallback(). Verified: myneta with scroll on → 52.5s, full content, within 90s budget.</w:t>
+      </w:r>
+    </w:p>
+    <w:p>
+      <w:pPr>
+        <w:pStyle w:val="ListParagraph"/>
+        <w:numPr>
+          <w:ilvl w:val="0"/>
+          <w:numId w:val="1"/>
+        </w:numPr>
+      </w:pPr>
+      <w:r>
+        <w:rPr>
+          <w:b/>
+        </w:rPr>
+        <w:t xml:space="preserve">Fetch errors surface as run failures: </w:t>
+      </w:r>
+      <w:r>
+        <w:t xml:space="preserve">tasks.py now sets run status to failed with a human-readable message when items_created == 0 and agent_errors is non-empty, instead of a misleading empty success.</w:t>
+      </w:r>
+    </w:p>
+    <w:p>
+      <w:pPr>
+        <w:pStyle w:val="ListParagraph"/>
+        <w:numPr>
+          <w:ilvl w:val="0"/>
+          <w:numId w:val="1"/>
+        </w:numPr>
+      </w:pPr>
+      <w:r>
+        <w:rPr>
+          <w:b/>
+        </w:rPr>
+        <w:t xml:space="preserve">URL post-processing — resolve relative links and strip markdown wrapping: </w:t>
+      </w:r>
+      <w:r>
+        <w:t xml:space="preserve">agent/graph.py adds clean_url_value and absolutize_row_urls. The LLM lifts hrefs from page markdown where links are relative and/or wrapped in markdown angle brackets. clean_url_value handles: (1) “https://site/&lt;/rel/path?id=1&gt;” → strips angle bracket, resolves to absolute; (2) “/rel/path” → resolves against page URL; (3) non-URL strings pass through unchanged. Applied in harvest_node and _preview_extract.</w:t>
+      </w:r>
+    </w:p>
+    <w:p>
+      <w:pPr>
+        <w:pStyle w:val="ListParagraph"/>
+        <w:numPr>
+          <w:ilvl w:val="0"/>
+          <w:numId w:val="1"/>
+        </w:numPr>
+      </w:pPr>
+      <w:r>
+        <w:rPr>
+          <w:b/>
+        </w:rPr>
+        <w:t xml:space="preserve">domcontentloaded instead of networkidle: </w:t>
+      </w:r>
+      <w:r>
+        <w:t xml:space="preserve">visual.py (snapshot) and crawl4ai_engine.py (run config) both now wait for domcontentloaded rather than networkidle. Heavy pages whose background requests never settle no longer hang. A short settle wait (800–1200ms) is kept. Snapshot default timeout raised to 60s.</w:t>
       </w:r>
     </w:p>
     <w:sectPr>

</xml_diff>

<commit_message>
docs(guide): add Section 18 (hardening & UX polish) — encryption, selectors, monitor/recipes/discover UX
</commit_message>
<xml_diff>
--- a/docs/Super_Scraper_Project_Guide.docx
+++ b/docs/Super_Scraper_Project_Guide.docx
@@ -13071,6 +13071,172 @@
       </w:r>
       <w:r>
         <w:t xml:space="preserve">visual.py (snapshot) and crawl4ai_engine.py (run config) both now wait for domcontentloaded rather than networkidle. Heavy pages whose background requests never settle no longer hang. A short settle wait (800–1200ms) is kept. Snapshot default timeout raised to 60s.</w:t>
+      </w:r>
+    </w:p>
+    <w:p>
+      <w:pPr>
+        <w:pStyle w:val="Heading1"/>
+      </w:pPr>
+      <w:r>
+        <w:t xml:space="preserve">18. Hardening &amp; UX Polish (Phase 10)</w:t>
+      </w:r>
+    </w:p>
+    <w:p>
+      <w:pPr>
+        <w:spacing w:after="120"/>
+      </w:pPr>
+      <w:r>
+        <w:t xml:space="preserve">A follow-up sprint covering security, robustness, and usability. All changes are committed and pushed to branch initial-run-testing.</w:t>
+      </w:r>
+    </w:p>
+    <w:p>
+      <w:pPr>
+        <w:pStyle w:val="Heading2"/>
+      </w:pPr>
+      <w:r>
+        <w:t xml:space="preserve">18.1 Destination Secret Encryption at Rest</w:t>
+      </w:r>
+    </w:p>
+    <w:p>
+      <w:pPr>
+        <w:pStyle w:val="ListParagraph"/>
+        <w:numPr>
+          <w:ilvl w:val="0"/>
+          <w:numId w:val="1"/>
+        </w:numPr>
+      </w:pPr>
+      <w:r>
+        <w:rPr>
+          <w:b/>
+        </w:rPr>
+        <w:t xml:space="preserve">backend/apps/core/crypto.py: </w:t>
+      </w:r>
+      <w:r>
+        <w:t xml:space="preserve">Fernet (AES-128-CBC + HMAC) field encryption keyed off settings.FIELD_ENCRYPTION_KEY (or SECRET_KEY). Secret config keys (dsn, secret, password, token, api_key, credentials, webhook url) are stored with an “enc:” prefix so encryption is idempotent and backward-compatible with plaintext rows. If the cryptography library is missing it degrades to a no-op, so the app never breaks.</w:t>
+      </w:r>
+    </w:p>
+    <w:p>
+      <w:pPr>
+        <w:pStyle w:val="ListParagraph"/>
+        <w:numPr>
+          <w:ilvl w:val="0"/>
+          <w:numId w:val="1"/>
+        </w:numPr>
+      </w:pPr>
+      <w:r>
+        <w:rPr>
+          <w:b/>
+        </w:rPr>
+        <w:t xml:space="preserve">models.py / serializers.py / migration 0006: </w:t>
+      </w:r>
+      <w:r>
+        <w:t xml:space="preserve">DataDestination.save() encrypts config; decrypted_config property feeds the delivery handlers; the serializer decrypts on read (owner only) and validates against real values on partial updates; migration 0006 encrypts existing rows in place. Verified: the DB stores enc: ciphertext while decrypted_config returns plaintext.</w:t>
+      </w:r>
+    </w:p>
+    <w:p>
+      <w:pPr>
+        <w:pStyle w:val="Heading2"/>
+      </w:pPr>
+      <w:r>
+        <w:t xml:space="preserve">18.2 Selector Hardening</w:t>
+      </w:r>
+    </w:p>
+    <w:p>
+      <w:pPr>
+        <w:pStyle w:val="ListParagraph"/>
+        <w:numPr>
+          <w:ilvl w:val="0"/>
+          <w:numId w:val="1"/>
+        </w:numPr>
+      </w:pPr>
+      <w:r>
+        <w:rPr>
+          <w:b/>
+        </w:rPr>
+        <w:t xml:space="preserve">scraping_engine.normalize_css_selector(): </w:t>
+      </w:r>
+      <w:r>
+        <w:t xml:space="preserve">rewrites jQuery-style :contains(…) to soupsieve’s :-soup-contains(…) before select(), applied to both container and field selectors. The LLM planner occasionally emits :contains(), which soupsieve now errors on; this makes such selectors usable again.</w:t>
+      </w:r>
+    </w:p>
+    <w:p>
+      <w:pPr>
+        <w:pStyle w:val="Heading2"/>
+      </w:pPr>
+      <w:r>
+        <w:t xml:space="preserve">18.3 UX: Persisted Discover Wizard, Recipes Page, Monitor Flow</w:t>
+      </w:r>
+    </w:p>
+    <w:p>
+      <w:pPr>
+        <w:pStyle w:val="ListParagraph"/>
+        <w:numPr>
+          <w:ilvl w:val="0"/>
+          <w:numId w:val="1"/>
+        </w:numPr>
+      </w:pPr>
+      <w:r>
+        <w:rPr>
+          <w:b/>
+        </w:rPr>
+        <w:t xml:space="preserve">Discover wizard state persistence: </w:t>
+      </w:r>
+      <w:r>
+        <w:t xml:space="preserve">app/discover/page.tsx saves sections, entries, and the selection to localStorage (gated by a ref so the first render doesn’t clobber saved state), so navigating to the dashboard and back no longer resets the wizard. A Start over button clears it.</w:t>
+      </w:r>
+    </w:p>
+    <w:p>
+      <w:pPr>
+        <w:pStyle w:val="ListParagraph"/>
+        <w:numPr>
+          <w:ilvl w:val="0"/>
+          <w:numId w:val="1"/>
+        </w:numPr>
+      </w:pPr>
+      <w:r>
+        <w:rPr>
+          <w:b/>
+        </w:rPr>
+        <w:t xml:space="preserve">app/recipes/page.tsx: </w:t>
+      </w:r>
+      <w:r>
+        <w:t xml:space="preserve">lists saved recipes and lets the user run one as a fresh job (create_job) or delete it. Reachable from the dashboard via the 📑 Recipes button.</w:t>
+      </w:r>
+    </w:p>
+    <w:p>
+      <w:pPr>
+        <w:pStyle w:val="ListParagraph"/>
+        <w:numPr>
+          <w:ilvl w:val="0"/>
+          <w:numId w:val="1"/>
+        </w:numPr>
+      </w:pPr>
+      <w:r>
+        <w:rPr>
+          <w:b/>
+        </w:rPr>
+        <w:t xml:space="preserve">app/monitor/page.tsx: </w:t>
+      </w:r>
+      <w:r>
+        <w:t xml:space="preserve">a single “watch this page” flow that creates a job, puts it on an interval schedule, and turns on change alerts (with an optional channel) in one submit — plus an output preview before committing. Verified: create 201 → schedule 200 → alerts 200. Reachable via the 🔔 Monitor button.</w:t>
+      </w:r>
+    </w:p>
+    <w:p>
+      <w:pPr>
+        <w:pStyle w:val="ListParagraph"/>
+        <w:numPr>
+          <w:ilvl w:val="0"/>
+          <w:numId w:val="1"/>
+        </w:numPr>
+      </w:pPr>
+      <w:r>
+        <w:rPr>
+          <w:b/>
+        </w:rPr>
+        <w:t xml:space="preserve">Visual-mode pagination: </w:t>
+      </w:r>
+      <w:r>
+        <w:t xml:space="preserve">already followed the “next” link via the CSS path; the visual page now shows a hint explaining the “pages to scrape” behaviour. Default fetch timeout default raised to 90s in committed settings.</w:t>
       </w:r>
     </w:p>
     <w:sectPr>

</xml_diff>

<commit_message>
docs: record outstanding backlog in CLAUDE.md + guide Section 19 (README left unmaintained by design)
</commit_message>
<xml_diff>
--- a/docs/Super_Scraper_Project_Guide.docx
+++ b/docs/Super_Scraper_Project_Guide.docx
@@ -13237,6 +13237,112 @@
       </w:r>
       <w:r>
         <w:t xml:space="preserve">already followed the “next” link via the CSS path; the visual page now shows a hint explaining the “pages to scrape” behaviour. Default fetch timeout default raised to 90s in committed settings.</w:t>
+      </w:r>
+    </w:p>
+    <w:p>
+      <w:pPr>
+        <w:pStyle w:val="Heading1"/>
+      </w:pPr>
+      <w:r>
+        <w:t xml:space="preserve">19. Outstanding Follow-ups (Backlog)</w:t>
+      </w:r>
+    </w:p>
+    <w:p>
+      <w:pPr>
+        <w:spacing w:after="120"/>
+      </w:pPr>
+      <w:r>
+        <w:t xml:space="preserve">Known items deferred as of this writing. This is the authoritative backlog — the root README.md is intentionally not maintained and still describes the old Flutter/GPT stack; keep this guide and CLAUDE.md current instead.</w:t>
+      </w:r>
+    </w:p>
+    <w:p>
+      <w:pPr>
+        <w:pStyle w:val="ListParagraph"/>
+        <w:numPr>
+          <w:ilvl w:val="0"/>
+          <w:numId w:val="1"/>
+        </w:numPr>
+      </w:pPr>
+      <w:r>
+        <w:rPr>
+          <w:b/>
+        </w:rPr>
+        <w:t xml:space="preserve">README not maintained: </w:t>
+      </w:r>
+      <w:r>
+        <w:t xml:space="preserve">root README.md predates the Next.js rewrite and the move to Gemini; treat docs/ and CLAUDE.md as the source of truth.</w:t>
+      </w:r>
+    </w:p>
+    <w:p>
+      <w:pPr>
+        <w:pStyle w:val="ListParagraph"/>
+        <w:numPr>
+          <w:ilvl w:val="0"/>
+          <w:numId w:val="1"/>
+        </w:numPr>
+      </w:pPr>
+      <w:r>
+        <w:rPr>
+          <w:b/>
+        </w:rPr>
+        <w:t xml:space="preserve">Mask secrets in API responses: </w:t>
+      </w:r>
+      <w:r>
+        <w:t xml:space="preserve">destination secrets are encrypted at rest (Section 18.1) but the serializer still returns decrypted values to the owner so the edit UI works. Make config write-only / masked in responses as a hardening step.</w:t>
+      </w:r>
+    </w:p>
+    <w:p>
+      <w:pPr>
+        <w:pStyle w:val="ListParagraph"/>
+        <w:numPr>
+          <w:ilvl w:val="0"/>
+          <w:numId w:val="1"/>
+        </w:numPr>
+      </w:pPr>
+      <w:r>
+        <w:rPr>
+          <w:b/>
+        </w:rPr>
+        <w:t xml:space="preserve">Visual-mode detail-link following: </w:t>
+      </w:r>
+      <w:r>
+        <w:t xml:space="preserve">the NL agent visits each item’s detail page; visual mode does not (it paginates but doesn’t follow per-row links). Parity is a follow-up.</w:t>
+      </w:r>
+    </w:p>
+    <w:p>
+      <w:pPr>
+        <w:pStyle w:val="ListParagraph"/>
+        <w:numPr>
+          <w:ilvl w:val="0"/>
+          <w:numId w:val="1"/>
+        </w:numPr>
+      </w:pPr>
+      <w:r>
+        <w:rPr>
+          <w:b/>
+        </w:rPr>
+        <w:t xml:space="preserve">Google Sheets live test: </w:t>
+      </w:r>
+      <w:r>
+        <w:t xml:space="preserve">the Sheets destination is built but not verified end-to-end — needs a service-account JSON with edit access.</w:t>
+      </w:r>
+    </w:p>
+    <w:p>
+      <w:pPr>
+        <w:pStyle w:val="ListParagraph"/>
+        <w:numPr>
+          <w:ilvl w:val="0"/>
+          <w:numId w:val="1"/>
+        </w:numPr>
+      </w:pPr>
+      <w:r>
+        <w:rPr>
+          <w:b/>
+        </w:rPr>
+        <w:t xml:space="preserve">Future scope (Section 16): </w:t>
+      </w:r>
+      <w:r>
+        <w:t xml:space="preserve">conversational refinement (multi-turn, needs a LangGraph checkpointer for human-in-the-loop state) and a web-search “universal” scraper (requires a per-conversation budget cap and a source-consent UI).</w:t>
       </w:r>
     </w:p>
     <w:sectPr>

</xml_diff>

<commit_message>
Mask destination secrets in API responses, docs, seed_recipes command
- DataDestinationSerializer now masks sensitive config keys in responses
  and restores masked values on update so edits round-trip
- README: replace stale Flutter references with the Next.js frontend
- Add seed_recipes management command
- docs: cost estimation, code-review improvement plan, progress log
</commit_message>
<xml_diff>
--- a/docs/Super_Scraper_Project_Guide.docx
+++ b/docs/Super_Scraper_Project_Guide.docx
@@ -1,5 +1,27 @@
 
-<file path=word/document.xml><?xml version="1.0" encoding="utf-8"?>
+<file path=docProps\app.xml><?xml version="1.0" encoding="utf-8"?>
+<Properties xmlns="http://schemas.openxmlformats.org/officeDocument/2006/extended-properties" xmlns:vt="http://schemas.openxmlformats.org/officeDocument/2006/docPropsVTypes"/>
+</file>
+
+<file path=docProps\core.xml><?xml version="1.0" encoding="utf-8"?>
+<cp:coreProperties xmlns:cp="http://schemas.openxmlformats.org/package/2006/metadata/core-properties" xmlns:dc="http://purl.org/dc/elements/1.1/" xmlns:dcterms="http://purl.org/dc/terms/" xmlns:dcmitype="http://purl.org/dc/dcmitype/" xmlns:xsi="http://www.w3.org/2001/XMLSchema-instance">
+  <dc:creator>Un-named</dc:creator>
+  <cp:lastModifiedBy>Un-named</cp:lastModifiedBy>
+  <cp:revision>1</cp:revision>
+  <dcterms:created xsi:type="dcterms:W3CDTF">2026-05-30T08:41:27.202Z</dcterms:created>
+  <dcterms:modified xsi:type="dcterms:W3CDTF">2026-05-30T08:41:27.203Z</dcterms:modified>
+</cp:coreProperties>
+</file>
+
+<file path=docProps\custom.xml><?xml version="1.0" encoding="utf-8"?>
+<Properties xmlns="http://schemas.openxmlformats.org/officeDocument/2006/custom-properties" xmlns:vt="http://schemas.openxmlformats.org/officeDocument/2006/docPropsVTypes"/>
+</file>
+
+<file path=word\comments.xml><?xml version="1.0" encoding="utf-8"?>
+<w:comments xmlns:cx="http://schemas.microsoft.com/office/drawing/2014/chartex" xmlns:cx1="http://schemas.microsoft.com/office/drawing/2015/9/8/chartex" xmlns:cx2="http://schemas.microsoft.com/office/drawing/2015/10/21/chartex" xmlns:cx3="http://schemas.microsoft.com/office/drawing/2016/5/9/chartex" xmlns:cx4="http://schemas.microsoft.com/office/drawing/2016/5/10/chartex" xmlns:cx5="http://schemas.microsoft.com/office/drawing/2016/5/11/chartex" xmlns:cx6="http://schemas.microsoft.com/office/drawing/2016/5/12/chartex" xmlns:cx7="http://schemas.microsoft.com/office/drawing/2016/5/13/chartex" xmlns:cx8="http://schemas.microsoft.com/office/drawing/2016/5/14/chartex" xmlns:mc="http://schemas.openxmlformats.org/markup-compatibility/2006" xmlns:aink="http://schemas.microsoft.com/office/drawing/2016/ink" xmlns:am3d="http://schemas.microsoft.com/office/drawing/2017/model3d" xmlns:o="urn:schemas-microsoft-com:office:office" xmlns:r="http://schemas.openxmlformats.org/officeDocument/2006/relationships" xmlns:m="http://schemas.openxmlformats.org/officeDocument/2006/math" xmlns:v="urn:schemas-microsoft-com:vml" xmlns:wp14="http://schemas.microsoft.com/office/word/2010/wordprocessingDrawing" xmlns:wp="http://schemas.openxmlformats.org/drawingml/2006/wordprocessingDrawing" xmlns:w10="urn:schemas-microsoft-com:office:word" xmlns:w="http://schemas.openxmlformats.org/wordprocessingml/2006/main" xmlns:w14="http://schemas.microsoft.com/office/word/2010/wordml" xmlns:w15="http://schemas.microsoft.com/office/word/2012/wordml" xmlns:w16cex="http://schemas.microsoft.com/office/word/2018/wordml/cex" xmlns:w16cid="http://schemas.microsoft.com/office/word/2016/wordml/cid" xmlns:w16="http://schemas.microsoft.com/office/word/2018/wordml" xmlns:w16sdtdh="http://schemas.microsoft.com/office/word/2020/wordml/sdtdatahash" xmlns:w16se="http://schemas.microsoft.com/office/word/2015/wordml/symex" xmlns:wpg="http://schemas.microsoft.com/office/word/2010/wordprocessingGroup" xmlns:wpi="http://schemas.microsoft.com/office/word/2010/wordprocessingInk" xmlns:wne="http://schemas.microsoft.com/office/word/2006/wordml" xmlns:wps="http://schemas.microsoft.com/office/word/2010/wordprocessingShape"/>
+</file>
+
+<file path=word\document.xml><?xml version="1.0" encoding="utf-8"?>
 <w:document xmlns:wpc="http://schemas.microsoft.com/office/word/2010/wordprocessingCanvas" xmlns:mc="http://schemas.openxmlformats.org/markup-compatibility/2006" xmlns:o="urn:schemas-microsoft-com:office:office" xmlns:r="http://schemas.openxmlformats.org/officeDocument/2006/relationships" xmlns:m="http://schemas.openxmlformats.org/officeDocument/2006/math" xmlns:v="urn:schemas-microsoft-com:vml" xmlns:wp14="http://schemas.microsoft.com/office/word/2010/wordprocessingDrawing" xmlns:wp="http://schemas.openxmlformats.org/drawingml/2006/wordprocessingDrawing" xmlns:w10="urn:schemas-microsoft-com:office:word" xmlns:w="http://schemas.openxmlformats.org/wordprocessingml/2006/main" xmlns:w14="http://schemas.microsoft.com/office/word/2010/wordml" xmlns:w15="http://schemas.microsoft.com/office/word/2012/wordml" xmlns:wpg="http://schemas.microsoft.com/office/word/2010/wordprocessingGroup" xmlns:wpi="http://schemas.microsoft.com/office/word/2010/wordprocessingInk" xmlns:wne="http://schemas.microsoft.com/office/word/2006/wordml" xmlns:wps="http://schemas.microsoft.com/office/word/2010/wordprocessingShape" xmlns:cx="http://schemas.microsoft.com/office/drawing/2014/chartex" xmlns:cx1="http://schemas.microsoft.com/office/drawing/2015/9/8/chartex" xmlns:cx2="http://schemas.microsoft.com/office/drawing/2015/10/21/chartex" xmlns:cx3="http://schemas.microsoft.com/office/drawing/2016/5/9/chartex" xmlns:cx4="http://schemas.microsoft.com/office/drawing/2016/5/10/chartex" xmlns:cx5="http://schemas.microsoft.com/office/drawing/2016/5/11/chartex" xmlns:cx6="http://schemas.microsoft.com/office/drawing/2016/5/12/chartex" xmlns:cx7="http://schemas.microsoft.com/office/drawing/2016/5/13/chartex" xmlns:cx8="http://schemas.microsoft.com/office/drawing/2016/5/14/chartex" xmlns:aink="http://schemas.microsoft.com/office/drawing/2016/ink" xmlns:am3d="http://schemas.microsoft.com/office/drawing/2017/model3d" xmlns:w16cex="http://schemas.microsoft.com/office/word/2018/wordml/cex" xmlns:w16cid="http://schemas.microsoft.com/office/word/2016/wordml/cid" xmlns:w16="http://schemas.microsoft.com/office/word/2018/wordml" xmlns:w16sdtdh="http://schemas.microsoft.com/office/word/2020/wordml/sdtdatahash" xmlns:w16se="http://schemas.microsoft.com/office/word/2015/wordml/symex" mc:Ignorable="w14 w15 wp14">
   <w:body>
     <w:p>
@@ -13352,15 +13374,24 @@
       <w:pgNumType/>
       <w:docGrid w:linePitch="360"/>
     </w:sectPr>
+    <w:p>
+      <w:pPr>
+        <w:pStyle w:val="Heading1"/>
+      </w:pPr>
+      <w:r>
+        <w:t>Phase 11: User Retention &amp; Security Fixes</w:t>
+      </w:r>
+    </w:p>
+    <w:p>
+      <w:r>
+        <w:t>Started implementation of user retention features including API secrets masking, community recipes seeding, and cost estimation documentation.</w:t>
+      </w:r>
+    </w:p>
   </w:body>
 </w:document>
 </file>
 
-<file path=word/comments.xml><?xml version="1.0" encoding="utf-8"?>
-<w:comments xmlns:cx="http://schemas.microsoft.com/office/drawing/2014/chartex" xmlns:cx1="http://schemas.microsoft.com/office/drawing/2015/9/8/chartex" xmlns:cx2="http://schemas.microsoft.com/office/drawing/2015/10/21/chartex" xmlns:cx3="http://schemas.microsoft.com/office/drawing/2016/5/9/chartex" xmlns:cx4="http://schemas.microsoft.com/office/drawing/2016/5/10/chartex" xmlns:cx5="http://schemas.microsoft.com/office/drawing/2016/5/11/chartex" xmlns:cx6="http://schemas.microsoft.com/office/drawing/2016/5/12/chartex" xmlns:cx7="http://schemas.microsoft.com/office/drawing/2016/5/13/chartex" xmlns:cx8="http://schemas.microsoft.com/office/drawing/2016/5/14/chartex" xmlns:mc="http://schemas.openxmlformats.org/markup-compatibility/2006" xmlns:aink="http://schemas.microsoft.com/office/drawing/2016/ink" xmlns:am3d="http://schemas.microsoft.com/office/drawing/2017/model3d" xmlns:o="urn:schemas-microsoft-com:office:office" xmlns:r="http://schemas.openxmlformats.org/officeDocument/2006/relationships" xmlns:m="http://schemas.openxmlformats.org/officeDocument/2006/math" xmlns:v="urn:schemas-microsoft-com:vml" xmlns:wp14="http://schemas.microsoft.com/office/word/2010/wordprocessingDrawing" xmlns:wp="http://schemas.openxmlformats.org/drawingml/2006/wordprocessingDrawing" xmlns:w10="urn:schemas-microsoft-com:office:word" xmlns:w="http://schemas.openxmlformats.org/wordprocessingml/2006/main" xmlns:w14="http://schemas.microsoft.com/office/word/2010/wordml" xmlns:w15="http://schemas.microsoft.com/office/word/2012/wordml" xmlns:w16cex="http://schemas.microsoft.com/office/word/2018/wordml/cex" xmlns:w16cid="http://schemas.microsoft.com/office/word/2016/wordml/cid" xmlns:w16="http://schemas.microsoft.com/office/word/2018/wordml" xmlns:w16sdtdh="http://schemas.microsoft.com/office/word/2020/wordml/sdtdatahash" xmlns:w16se="http://schemas.microsoft.com/office/word/2015/wordml/symex" xmlns:wpg="http://schemas.microsoft.com/office/word/2010/wordprocessingGroup" xmlns:wpi="http://schemas.microsoft.com/office/word/2010/wordprocessingInk" xmlns:wne="http://schemas.microsoft.com/office/word/2006/wordml" xmlns:wps="http://schemas.microsoft.com/office/word/2010/wordprocessingShape"/>
-</file>
-
-<file path=word/endnotes.xml><?xml version="1.0" encoding="utf-8"?>
+<file path=word\endnotes.xml><?xml version="1.0" encoding="utf-8"?>
 <w:endnotes xmlns:wpc="http://schemas.microsoft.com/office/word/2010/wordprocessingCanvas" xmlns:mc="http://schemas.openxmlformats.org/markup-compatibility/2006" xmlns:o="urn:schemas-microsoft-com:office:office" xmlns:r="http://schemas.openxmlformats.org/officeDocument/2006/relationships" xmlns:m="http://schemas.openxmlformats.org/officeDocument/2006/math" xmlns:v="urn:schemas-microsoft-com:vml" xmlns:wp14="http://schemas.microsoft.com/office/word/2010/wordprocessingDrawing" xmlns:wp="http://schemas.openxmlformats.org/drawingml/2006/wordprocessingDrawing" xmlns:w10="urn:schemas-microsoft-com:office:word" xmlns:w="http://schemas.openxmlformats.org/wordprocessingml/2006/main" xmlns:w14="http://schemas.microsoft.com/office/word/2010/wordml" xmlns:w15="http://schemas.microsoft.com/office/word/2012/wordml" xmlns:wpg="http://schemas.microsoft.com/office/word/2010/wordprocessingGroup" xmlns:wpi="http://schemas.microsoft.com/office/word/2010/wordprocessingInk" xmlns:wne="http://schemas.microsoft.com/office/word/2006/wordml" xmlns:wps="http://schemas.microsoft.com/office/word/2010/wordprocessingShape" mc:Ignorable="w14 w15 wp14">
   <w:endnote w:type="separator" w:id="-1">
     <w:p>
@@ -13397,7 +13428,11 @@
 </w:endnotes>
 </file>
 
-<file path=word/footer1.xml><?xml version="1.0" encoding="utf-8"?>
+<file path=word\fontTable.xml><?xml version="1.0" encoding="utf-8"?>
+<w:fonts xmlns:mc="http://schemas.openxmlformats.org/markup-compatibility/2006" xmlns:r="http://schemas.openxmlformats.org/officeDocument/2006/relationships" xmlns:w="http://schemas.openxmlformats.org/wordprocessingml/2006/main" xmlns:w14="http://schemas.microsoft.com/office/word/2010/wordml" xmlns:w15="http://schemas.microsoft.com/office/word/2012/wordml" xmlns:w16cex="http://schemas.microsoft.com/office/word/2018/wordml/cex" xmlns:w16cid="http://schemas.microsoft.com/office/word/2016/wordml/cid" xmlns:w16="http://schemas.microsoft.com/office/word/2018/wordml" xmlns:w16sdtdh="http://schemas.microsoft.com/office/word/2020/wordml/sdtdatahash" xmlns:w16se="http://schemas.microsoft.com/office/word/2015/wordml/symex" mc:Ignorable="w14 w15 w16se w16cid w16 w16cex w16sdtdh"/>
+</file>
+
+<file path=word\footer1.xml><?xml version="1.0" encoding="utf-8"?>
 <w:ftr xmlns:wpc="http://schemas.microsoft.com/office/word/2010/wordprocessingCanvas" xmlns:mc="http://schemas.openxmlformats.org/markup-compatibility/2006" xmlns:o="urn:schemas-microsoft-com:office:office" xmlns:r="http://schemas.openxmlformats.org/officeDocument/2006/relationships" xmlns:m="http://schemas.openxmlformats.org/officeDocument/2006/math" xmlns:v="urn:schemas-microsoft-com:vml" xmlns:wp14="http://schemas.microsoft.com/office/word/2010/wordprocessingDrawing" xmlns:wp="http://schemas.openxmlformats.org/drawingml/2006/wordprocessingDrawing" xmlns:w10="urn:schemas-microsoft-com:office:word" xmlns:w="http://schemas.openxmlformats.org/wordprocessingml/2006/main" xmlns:w14="http://schemas.microsoft.com/office/word/2010/wordml" xmlns:w15="http://schemas.microsoft.com/office/word/2012/wordml" xmlns:wpg="http://schemas.microsoft.com/office/word/2010/wordprocessingGroup" xmlns:wpi="http://schemas.microsoft.com/office/word/2010/wordprocessingInk" xmlns:wne="http://schemas.microsoft.com/office/word/2006/wordml" xmlns:wps="http://schemas.microsoft.com/office/word/2010/wordprocessingShape">
   <w:p>
     <w:pPr>
@@ -13426,7 +13461,7 @@
 </w:ftr>
 </file>
 
-<file path=word/footnotes.xml><?xml version="1.0" encoding="utf-8"?>
+<file path=word\footnotes.xml><?xml version="1.0" encoding="utf-8"?>
 <w:footnotes xmlns:wpc="http://schemas.microsoft.com/office/word/2010/wordprocessingCanvas" xmlns:mc="http://schemas.openxmlformats.org/markup-compatibility/2006" xmlns:o="urn:schemas-microsoft-com:office:office" xmlns:r="http://schemas.openxmlformats.org/officeDocument/2006/relationships" xmlns:m="http://schemas.openxmlformats.org/officeDocument/2006/math" xmlns:v="urn:schemas-microsoft-com:vml" xmlns:wp14="http://schemas.microsoft.com/office/word/2010/wordprocessingDrawing" xmlns:wp="http://schemas.openxmlformats.org/drawingml/2006/wordprocessingDrawing" xmlns:w10="urn:schemas-microsoft-com:office:word" xmlns:w="http://schemas.openxmlformats.org/wordprocessingml/2006/main" xmlns:w14="http://schemas.microsoft.com/office/word/2010/wordml" xmlns:w15="http://schemas.microsoft.com/office/word/2012/wordml" xmlns:wpg="http://schemas.microsoft.com/office/word/2010/wordprocessingGroup" xmlns:wpi="http://schemas.microsoft.com/office/word/2010/wordprocessingInk" xmlns:wne="http://schemas.microsoft.com/office/word/2006/wordml" xmlns:wps="http://schemas.microsoft.com/office/word/2010/wordprocessingShape" mc:Ignorable="w14 w15 wp14">
   <w:footnote w:type="separator" w:id="-1">
     <w:p>
@@ -13463,7 +13498,7 @@
 </w:footnotes>
 </file>
 
-<file path=word/numbering.xml><?xml version="1.0" encoding="utf-8"?>
+<file path=word\numbering.xml><?xml version="1.0" encoding="utf-8"?>
 <w:numbering xmlns:wpc="http://schemas.microsoft.com/office/word/2010/wordprocessingCanvas" xmlns:mc="http://schemas.openxmlformats.org/markup-compatibility/2006" xmlns:o="urn:schemas-microsoft-com:office:office" xmlns:r="http://schemas.openxmlformats.org/officeDocument/2006/relationships" xmlns:m="http://schemas.openxmlformats.org/officeDocument/2006/math" xmlns:v="urn:schemas-microsoft-com:vml" xmlns:wp14="http://schemas.microsoft.com/office/word/2010/wordprocessingDrawing" xmlns:wp="http://schemas.openxmlformats.org/drawingml/2006/wordprocessingDrawing" xmlns:w10="urn:schemas-microsoft-com:office:word" xmlns:w="http://schemas.openxmlformats.org/wordprocessingml/2006/main" xmlns:w14="http://schemas.microsoft.com/office/word/2010/wordml" xmlns:w15="http://schemas.microsoft.com/office/word/2012/wordml" xmlns:wpg="http://schemas.microsoft.com/office/word/2010/wordprocessingGroup" xmlns:wpi="http://schemas.microsoft.com/office/word/2010/wordprocessingInk" xmlns:wne="http://schemas.microsoft.com/office/word/2006/wordml" xmlns:wps="http://schemas.microsoft.com/office/word/2010/wordprocessingShape" mc:Ignorable="w14 w15 wp14">
   <w:abstractNum w:abstractNumId="1" w15:restartNumberingAfterBreak="0">
     <w:multiLevelType w:val="hybridMultilevel"/>
@@ -13660,7 +13695,17 @@
 </w:numbering>
 </file>
 
-<file path=word/styles.xml><?xml version="1.0" encoding="utf-8"?>
+<file path=word\settings.xml><?xml version="1.0" encoding="utf-8"?>
+<w:settings xmlns:wpc="http://schemas.microsoft.com/office/word/2010/wordprocessingCanvas" xmlns:mc="http://schemas.openxmlformats.org/markup-compatibility/2006" xmlns:o="urn:schemas-microsoft-com:office:office" xmlns:r="http://schemas.openxmlformats.org/officeDocument/2006/relationships" xmlns:m="http://schemas.openxmlformats.org/officeDocument/2006/math" xmlns:v="urn:schemas-microsoft-com:vml" xmlns:wp14="http://schemas.microsoft.com/office/word/2010/wordprocessingDrawing" xmlns:wp="http://schemas.openxmlformats.org/drawingml/2006/wordprocessingDrawing" xmlns:w10="urn:schemas-microsoft-com:office:word" xmlns:w="http://schemas.openxmlformats.org/wordprocessingml/2006/main" xmlns:w14="http://schemas.microsoft.com/office/word/2010/wordml" xmlns:w15="http://schemas.microsoft.com/office/word/2012/wordml" xmlns:wpg="http://schemas.microsoft.com/office/word/2010/wordprocessingGroup" xmlns:wpi="http://schemas.microsoft.com/office/word/2010/wordprocessingInk" xmlns:wne="http://schemas.microsoft.com/office/word/2006/wordml" xmlns:wps="http://schemas.microsoft.com/office/word/2010/wordprocessingShape" mc:Ignorable="w14 w15 wp14">
+  <w:displayBackgroundShape/>
+  <w:evenAndOddHeaders w:val="false"/>
+  <w:compat>
+    <w:compatSetting w:val="15" w:name="compatibilityMode" w:uri="http://schemas.microsoft.com/office/word"/>
+  </w:compat>
+</w:settings>
+</file>
+
+<file path=word\styles.xml><?xml version="1.0" encoding="utf-8"?>
 <w:styles xmlns:mc="http://schemas.openxmlformats.org/markup-compatibility/2006" xmlns:r="http://schemas.openxmlformats.org/officeDocument/2006/relationships" xmlns:w="http://schemas.openxmlformats.org/wordprocessingml/2006/main" xmlns:w14="http://schemas.microsoft.com/office/word/2010/wordml" xmlns:w15="http://schemas.microsoft.com/office/word/2012/wordml" mc:Ignorable="w14 w15">
   <w:docDefaults>
     <w:rPrDefault>

</xml_diff>